<commit_message>
Updated book & README file
</commit_message>
<xml_diff>
--- a/Project_Book_B_.docx
+++ b/Project_Book_B_.docx
@@ -28,7 +28,7 @@
           <w:noProof/>
         </w:rPr>
         <w:drawing>
-          <wp:inline distT="114300" distB="114300" distL="114300" distR="114300" wp14:anchorId="1886B415" wp14:editId="02B7583C">
+          <wp:inline distT="114300" distB="114300" distL="114300" distR="114300" wp14:anchorId="2477B9C1" wp14:editId="201DD99D">
             <wp:extent cx="3300413" cy="774587"/>
             <wp:effectExtent l="0" t="0" r="0" b="0"/>
             <wp:docPr id="1" name="image1.png" descr="A close up of a logo&#10;&#10;Description automatically generated"/>
@@ -146,32 +146,6 @@
     </w:p>
     <w:p>
       <w:pPr>
-        <w:pStyle w:val="Heading1"/>
-        <w:keepLines w:val="0"/>
-        <w:spacing w:before="240" w:after="160" w:line="240" w:lineRule="auto"/>
-        <w:jc w:val="center"/>
-        <w:rPr>
-          <w:b/>
-          <w:bCs/>
-          <w:sz w:val="22"/>
-          <w:szCs w:val="22"/>
-        </w:rPr>
-      </w:pPr>
-      <w:bookmarkStart w:id="0" w:name="_r3euvflplnes" w:colFirst="0" w:colLast="0"/>
-      <w:bookmarkEnd w:id="0"/>
-      <w:r>
-        <w:rPr>
-          <w:rFonts w:ascii="Calibri" w:eastAsia="Calibri" w:hAnsi="Calibri" w:cs="Calibri"/>
-          <w:b/>
-          <w:bCs/>
-          <w:sz w:val="22"/>
-          <w:szCs w:val="22"/>
-        </w:rPr>
-        <w:t>subtitle</w:t>
-      </w:r>
-    </w:p>
-    <w:p>
-      <w:pPr>
         <w:spacing w:after="160" w:line="259" w:lineRule="auto"/>
         <w:jc w:val="center"/>
         <w:rPr>
@@ -180,6 +154,8 @@
           <w:lang w:val="en-US"/>
         </w:rPr>
       </w:pPr>
+      <w:bookmarkStart w:id="0" w:name="_r3euvflplnes" w:colFirst="0" w:colLast="0"/>
+      <w:bookmarkEnd w:id="0"/>
       <w:r>
         <w:rPr>
           <w:b/>
@@ -282,6 +258,7 @@
         <w:rPr>
           <w:b/>
           <w:bCs/>
+          <w:rtl/>
         </w:rPr>
       </w:pPr>
       <w:r>
@@ -328,7 +305,7 @@
           <w:iCs/>
           <w:lang w:val="en-US"/>
         </w:rPr>
-        <w:t>Zeev Volkovich</w:t>
+        <w:t>Renata Avros</w:t>
       </w:r>
     </w:p>
     <w:p>
@@ -342,10 +319,27 @@
       </w:pPr>
       <w:r>
         <w:rPr>
+          <w:rFonts w:hint="cs"/>
           <w:b/>
           <w:bCs/>
         </w:rPr>
-        <w:t>Dr.</w:t>
+        <w:t>P</w:t>
+      </w:r>
+      <w:r>
+        <w:rPr>
+          <w:rFonts w:hint="cs"/>
+          <w:b/>
+          <w:bCs/>
+          <w:rtl/>
+        </w:rPr>
+        <w:t>rof</w:t>
+      </w:r>
+      <w:r>
+        <w:rPr>
+          <w:b/>
+          <w:bCs/>
+        </w:rPr>
+        <w:t>.</w:t>
       </w:r>
       <w:r>
         <w:rPr>
@@ -367,7 +361,7 @@
           <w:iCs/>
           <w:lang w:val="en-US"/>
         </w:rPr>
-        <w:t>Renata Avros</w:t>
+        <w:t>Zeev Volkovich</w:t>
       </w:r>
     </w:p>
     <w:p>
@@ -537,10 +531,7 @@
         <w:pStyle w:val="NormalWeb"/>
       </w:pPr>
       <w:r>
-        <w:t>In the first version, we implemented a CNN-based Deep Impostors pipeline using Hebrew FastText-initialized word representations and a hybrid Conv1D-BiLSTM-Attention separator model</w:t>
-      </w:r>
-      <w:r>
-        <w:t>. First, the system loads the corpora, cleans the texts from punctuation marks, irrelevant characters, and vowel marks, and then divides them into fixed-size windows. Each such window represents a small segment of the text. Then, each word in the window is converted into a vector using Hebrew FastText, so each window becomes a numerical structure that can be given as input to a neural network. The CNN is used as a separator model, meaning that it is trained to distinguish between two different external sources, called impostors. After the model learns to distinguish between two external styles, it is applied to the target text, in our case the books or chapters of the Torah. For each window in the target text, the model produces a decision or probability, and the sequence of these decisions along the text becomes the stylistic signal.</w:t>
+        <w:t>In the first version, we implemented a CNN-based Deep Impostors pipeline using Hebrew FastText-initialized word representations and a hybrid Conv1D-BiLSTM-Attention separator model. First, the system loads the corpora, cleans the texts from punctuation marks, irrelevant characters, and vowel marks, and then divides them into fixed-size windows. Each such window represents a small segment of the text. Then, each word in the window is converted into a vector using Hebrew FastText, so each window becomes a numerical structure that can be given as input to a neural network. The CNN is used as a separator model, meaning that it is trained to distinguish between two different external sources, called impostors. After the model learns to distinguish between two external styles, it is applied to the target text, in our case the books or chapters of the Torah. For each window in the target text, the model produces a decision or probability, and the sequence of these decisions along the text becomes the stylistic signal.</w:t>
       </w:r>
     </w:p>
     <w:p>
@@ -556,10 +547,7 @@
         <w:pStyle w:val="NormalWeb"/>
       </w:pPr>
       <w:r>
-        <w:t xml:space="preserve">After the stylistic signal is created, the analytical algorithms are applied. To compare different stylistic signals, we used FastDTW, which makes it possible to compare sequences even when they are not perfectly aligned or when there are differences in length. Then, distance matrices are created to represent the similarity or difference between the different textual units. Based on these matrices, </w:t>
-      </w:r>
-      <w:r>
-        <w:t>we used K-Medoids clustering on the precomputed FastDTW distance matrix</w:t>
+        <w:t>After the stylistic signal is created, the analytical algorithms are applied. To compare different stylistic signals, we used FastDTW, which makes it possible to compare sequences even when they are not perfectly aligned or when there are differences in length. Then, distance matrices are created to represent the similarity or difference between the different textual units. Based on these matrices, we used K-Medoids clustering on the precomputed FastDTW distance matrix</w:t>
       </w:r>
       <w:r>
         <w:rPr>
@@ -986,7 +974,7 @@
                 <w:noProof/>
               </w:rPr>
               <w:drawing>
-                <wp:inline distT="0" distB="0" distL="0" distR="0" wp14:anchorId="2BC3DC37" wp14:editId="0121A9B5">
+                <wp:inline distT="0" distB="0" distL="0" distR="0" wp14:anchorId="34320DDD" wp14:editId="7F4AA91A">
                   <wp:extent cx="6858000" cy="2451735"/>
                   <wp:effectExtent l="0" t="0" r="0" b="0"/>
                   <wp:docPr id="1771778092" name="Picture 1"/>
@@ -1077,7 +1065,7 @@
                 <w:noProof/>
               </w:rPr>
               <w:drawing>
-                <wp:inline distT="0" distB="0" distL="0" distR="0" wp14:anchorId="27B4D6C7" wp14:editId="154E8A70">
+                <wp:inline distT="0" distB="0" distL="0" distR="0" wp14:anchorId="6E465822" wp14:editId="1BAFFCC6">
                   <wp:extent cx="6858000" cy="2451735"/>
                   <wp:effectExtent l="0" t="0" r="0" b="0"/>
                   <wp:docPr id="142667801" name="Picture 2"/>
@@ -1222,7 +1210,7 @@
                 <w:noProof/>
               </w:rPr>
               <w:drawing>
-                <wp:inline distT="0" distB="0" distL="0" distR="0" wp14:anchorId="50AB70DA" wp14:editId="0BCE6C6B">
+                <wp:inline distT="0" distB="0" distL="0" distR="0" wp14:anchorId="49810B79" wp14:editId="76A20F19">
                   <wp:extent cx="6157595" cy="2035175"/>
                   <wp:effectExtent l="0" t="0" r="1905" b="0"/>
                   <wp:docPr id="1449612276" name="Picture 3"/>
@@ -1313,7 +1301,7 @@
                 <w:noProof/>
               </w:rPr>
               <w:drawing>
-                <wp:inline distT="0" distB="0" distL="0" distR="0" wp14:anchorId="1BD41561" wp14:editId="1F89FD7D">
+                <wp:inline distT="0" distB="0" distL="0" distR="0" wp14:anchorId="422A32BC" wp14:editId="67E92B7D">
                   <wp:extent cx="6157595" cy="2035175"/>
                   <wp:effectExtent l="0" t="0" r="1905" b="0"/>
                   <wp:docPr id="1683457848" name="Picture 4"/>
@@ -1442,7 +1430,7 @@
               </w:rPr>
               <w:lastRenderedPageBreak/>
               <w:drawing>
-                <wp:inline distT="0" distB="0" distL="0" distR="0" wp14:anchorId="1F2234BB" wp14:editId="53FFBEFB">
+                <wp:inline distT="0" distB="0" distL="0" distR="0" wp14:anchorId="77364867" wp14:editId="78848A21">
                   <wp:extent cx="2995350" cy="4372150"/>
                   <wp:effectExtent l="0" t="0" r="1905" b="0"/>
                   <wp:docPr id="1627861644" name="Picture 5"/>
@@ -1515,7 +1503,7 @@
                 <w:noProof/>
               </w:rPr>
               <w:drawing>
-                <wp:inline distT="0" distB="0" distL="0" distR="0" wp14:anchorId="7E0E369B" wp14:editId="50186C4E">
+                <wp:inline distT="0" distB="0" distL="0" distR="0" wp14:anchorId="0FB417CA" wp14:editId="0B016758">
                   <wp:extent cx="3201090" cy="4410623"/>
                   <wp:effectExtent l="0" t="0" r="0" b="0"/>
                   <wp:docPr id="232536989" name="Picture 6"/>
@@ -1747,11 +1735,8 @@
         <w:pStyle w:val="isselectedend"/>
       </w:pPr>
       <w:r>
-        <w:t xml:space="preserve">Another important lesson is that comparing different methodologies can be stronger than relying on a single model. The fact that CNN and Sen2Pro produced similar outputs in the main patterns gave us more confidence </w:t>
-      </w:r>
-      <w:r>
         <w:lastRenderedPageBreak/>
-        <w:t>in the results. Instead of saying “this model found a pattern,” we can say that two different approaches point in a similar direction. This is a significant advantage in a research project, where the goal is not only to reach a result, but also to estimate how reliable it is.</w:t>
+        <w:t>Another important lesson is that comparing different methodologies can be stronger than relying on a single model. The fact that CNN and Sen2Pro produced similar outputs in the main patterns gave us more confidence in the results. Instead of saying “this model found a pattern,” we can say that two different approaches point in a similar direction. This is a significant advantage in a research project, where the goal is not only to reach a result, but also to estimate how reliable it is.</w:t>
       </w:r>
     </w:p>
     <w:p>
@@ -1978,6 +1963,7 @@
         <w:pStyle w:val="isselectedend"/>
       </w:pPr>
       <w:r>
+        <w:lastRenderedPageBreak/>
         <w:t xml:space="preserve">In the main running cell of the CNN version, two main objects are defined: </w:t>
       </w:r>
       <w:r>
@@ -2008,12 +1994,462 @@
         <w:t>PipelinePaths</w:t>
       </w:r>
       <w:r>
-        <w:t xml:space="preserve"> object defines the project folder and the results folder. In our </w:t>
-      </w:r>
+        <w:t xml:space="preserve"> object defines the project folder and the results folder. In our implementation, the project folder is </w:t>
+      </w:r>
+      <w:r>
+        <w:rPr>
+          <w:rStyle w:val="HTMLCode"/>
+          <w:rFonts w:eastAsiaTheme="majorEastAsia"/>
+        </w:rPr>
+        <w:t>deep_imposters_final_project</w:t>
+      </w:r>
+      <w:r>
+        <w:t xml:space="preserve">, and the results folder of the CNN version is usually </w:t>
+      </w:r>
+      <w:r>
+        <w:rPr>
+          <w:rStyle w:val="HTMLCode"/>
+          <w:rFonts w:eastAsiaTheme="majorEastAsia"/>
+        </w:rPr>
+        <w:t>hebrew_results</w:t>
+      </w:r>
+      <w:r>
+        <w:t xml:space="preserve">. The </w:t>
+      </w:r>
+      <w:r>
+        <w:rPr>
+          <w:rStyle w:val="HTMLCode"/>
+          <w:rFonts w:eastAsiaTheme="majorEastAsia"/>
+        </w:rPr>
+        <w:t>ExperimentConfig</w:t>
+      </w:r>
+      <w:r>
+        <w:t xml:space="preserve"> object defines the experiment parameters, such as the vector size </w:t>
+      </w:r>
+      <w:r>
+        <w:rPr>
+          <w:rStyle w:val="HTMLCode"/>
+          <w:rFonts w:eastAsiaTheme="majorEastAsia"/>
+        </w:rPr>
+        <w:t>embedding_dimension=300</w:t>
+      </w:r>
+      <w:r>
+        <w:t xml:space="preserve">, the chunk size, the representation method </w:t>
+      </w:r>
+      <w:r>
+        <w:rPr>
+          <w:rStyle w:val="HTMLCode"/>
+          <w:rFonts w:eastAsiaTheme="majorEastAsia"/>
+        </w:rPr>
+        <w:t>hebrew_fasttext_vec</w:t>
+      </w:r>
+      <w:r>
+        <w:t>, and the CNN model settings.</w:t>
+      </w:r>
+    </w:p>
+    <w:p>
+      <w:pPr>
+        <w:pStyle w:val="isselectedend"/>
+      </w:pPr>
+      <w:r>
+        <w:t xml:space="preserve">After defining the paths and parameters, the user creates a </w:t>
+      </w:r>
+      <w:r>
+        <w:rPr>
+          <w:rStyle w:val="HTMLCode"/>
+          <w:rFonts w:eastAsiaTheme="majorEastAsia"/>
+        </w:rPr>
+        <w:t>DeepImpostorsPipeline</w:t>
+      </w:r>
+      <w:r>
+        <w:t xml:space="preserve"> object and runs the command </w:t>
+      </w:r>
+      <w:r>
+        <w:rPr>
+          <w:rStyle w:val="HTMLCode"/>
+          <w:rFonts w:eastAsiaTheme="majorEastAsia"/>
+        </w:rPr>
+        <w:t>pipeline.run()</w:t>
+      </w:r>
+      <w:r>
+        <w:t>. In a full run, the system goes over author pairs from the two impostor folders, trains a CNN model for each pair, applies the model to the Torah units, and produces analysis outputs. During the run, the system cleans the Hebrew texts, removes vowel marks and cantillation marks, removes punctuation marks, removes English letters, and keeps only Hebrew tokens. Then it divides the texts into blocks, converts them into FastText embeddings, trains the CNN network, produces predictions for the Torah units, builds stylistic signals, calculates a distance matrix using FastDTW, and applies Isolation Forest and KMedoids for anomaly and cluster analysis.</w:t>
+      </w:r>
+    </w:p>
+    <w:p>
+      <w:pPr>
+        <w:pStyle w:val="isselectedend"/>
+      </w:pPr>
+      <w:r>
+        <w:t xml:space="preserve">For a user who wants to check that the system works before running a full experiment, there is an option to run a single-pair test. In this cell, two authors are defined, for example Yehuda Alharizi and Berechiah ha-Nakdan, and the system runs the full pipeline only on this pair. This test is recommended before a full run, because it allows the user to verify that the paths are correct, the text files are loaded, the FastText file is located in the correct place, and the system is able to generate output files. After this test, the user can open the output folder and check that files such as accuracy/loss graphs, </w:t>
+      </w:r>
+      <w:r>
+        <w:rPr>
+          <w:rStyle w:val="HTMLCode"/>
+          <w:rFonts w:eastAsiaTheme="majorEastAsia"/>
+        </w:rPr>
+        <w:t>res_report</w:t>
+      </w:r>
+      <w:r>
+        <w:t xml:space="preserve"> files, a distance matrix, and clustering results were created.</w:t>
+      </w:r>
+    </w:p>
+    <w:p>
+      <w:pPr>
+        <w:pStyle w:val="isselectedend"/>
+      </w:pPr>
+      <w:r>
+        <w:t xml:space="preserve">If the user wants to start a full experiment from the beginning, they should run the cell that executes </w:t>
+      </w:r>
+      <w:r>
+        <w:rPr>
+          <w:rStyle w:val="HTMLCode"/>
+          <w:rFonts w:eastAsiaTheme="majorEastAsia"/>
+        </w:rPr>
+        <w:t>pipeline.reset_progress()</w:t>
+      </w:r>
+      <w:r>
+        <w:t xml:space="preserve"> and then </w:t>
+      </w:r>
+      <w:r>
+        <w:rPr>
+          <w:rStyle w:val="HTMLCode"/>
+          <w:rFonts w:eastAsiaTheme="majorEastAsia"/>
+        </w:rPr>
+        <w:t>pipeline.run(resume=False)</w:t>
+      </w:r>
+      <w:r>
+        <w:t xml:space="preserve">. This action resets the progress file and starts the entire experiment from scratch. If the run was stopped in the middle, for example because Colab disconnected, the user should run the definition cells again and then run the recovery cell that executes </w:t>
+      </w:r>
+      <w:r>
+        <w:rPr>
+          <w:rStyle w:val="HTMLCode"/>
+          <w:rFonts w:eastAsiaTheme="majorEastAsia"/>
+        </w:rPr>
+        <w:t>pipeline.run(resume=True)</w:t>
+      </w:r>
+      <w:r>
+        <w:t xml:space="preserve">. In this mode, the system reads the </w:t>
+      </w:r>
+      <w:r>
+        <w:rPr>
+          <w:rStyle w:val="HTMLCode"/>
+          <w:rFonts w:eastAsiaTheme="majorEastAsia"/>
+        </w:rPr>
+        <w:t>progress.json</w:t>
+      </w:r>
+      <w:r>
+        <w:t xml:space="preserve"> file and continues from the next author pair that has not yet been completed.</w:t>
+      </w:r>
+    </w:p>
+    <w:p>
+      <w:pPr>
+        <w:pStyle w:val="Heading2"/>
+      </w:pPr>
+      <w:r>
+        <w:t>A.3 Running the Sen2Pro Version</w:t>
+      </w:r>
+    </w:p>
+    <w:p>
+      <w:pPr>
+        <w:pStyle w:val="isselectedend"/>
+      </w:pPr>
+      <w:r>
+        <w:t>To run the Sen2Pro version, the user should open the relevant Colab notebook and run the cells in order. Here as well, the process starts by mounting Google Drive and installing the required libraries. Then, the system components are defined: corpus loading, text cleaning, division into segments, creation of BERT representations with MC Dropout, building a balanced dataset, training a classifier, predicting on the Torah texts, building style signals, calculating a distance matrix, performing anomaly and clustering analysis, and saving the outputs.</w:t>
+      </w:r>
+    </w:p>
+    <w:p>
+      <w:pPr>
+        <w:pStyle w:val="isselectedend"/>
+      </w:pPr>
+      <w:r>
+        <w:t xml:space="preserve">In the Sen2Pro version, the </w:t>
+      </w:r>
+      <w:r>
+        <w:rPr>
+          <w:rStyle w:val="HTMLCode"/>
+          <w:rFonts w:eastAsiaTheme="majorEastAsia"/>
+        </w:rPr>
+        <w:t>ExperimentConfig</w:t>
+      </w:r>
+      <w:r>
+        <w:t xml:space="preserve"> object includes parameters suitable for working with Hebrew BERT: the model name </w:t>
+      </w:r>
+      <w:r>
+        <w:rPr>
+          <w:rStyle w:val="HTMLCode"/>
+          <w:rFonts w:eastAsiaTheme="majorEastAsia"/>
+        </w:rPr>
+        <w:t>bert_model_name</w:t>
+      </w:r>
+      <w:r>
+        <w:t xml:space="preserve">, maximum length </w:t>
+      </w:r>
+      <w:r>
+        <w:rPr>
+          <w:rStyle w:val="HTMLCode"/>
+          <w:rFonts w:eastAsiaTheme="majorEastAsia"/>
+        </w:rPr>
+        <w:t>max_length</w:t>
+      </w:r>
+      <w:r>
+        <w:t xml:space="preserve">, number of words in each segment, number of MC Dropout samples through </w:t>
+      </w:r>
+      <w:r>
+        <w:rPr>
+          <w:rStyle w:val="HTMLCode"/>
+          <w:rFonts w:eastAsiaTheme="majorEastAsia"/>
+        </w:rPr>
+        <w:t>mc_samples</w:t>
+      </w:r>
+      <w:r>
+        <w:t xml:space="preserve">, number of epochs, batch size, learning rate, dropout rate, and whether to freeze the BERT layers using </w:t>
+      </w:r>
+      <w:r>
+        <w:rPr>
+          <w:rStyle w:val="HTMLCode"/>
+          <w:rFonts w:eastAsiaTheme="majorEastAsia"/>
+        </w:rPr>
+        <w:t>freeze_bert</w:t>
+      </w:r>
+      <w:r>
+        <w:t>. In our implementation, the method used is Sen2Pro-style, based only on model uncertainty through MC Dropout. In other words, there is no data augmentation such as word deletion, word replacement, or adding new words. Instead, the same segment is sampled several times through the model with active dropout. This approach allows the system to obtain both a representation and an uncertainty measure for each segment.</w:t>
+      </w:r>
+    </w:p>
+    <w:p>
+      <w:pPr>
+        <w:pStyle w:val="isselectedend"/>
+      </w:pPr>
       <w:r>
         <w:lastRenderedPageBreak/>
-        <w:t xml:space="preserve">implementation, the project folder is </w:t>
-      </w:r>
+        <w:t xml:space="preserve">The user can run the Sen2Pro version in two ways. The first way is a full run, where the system goes over all author pairs from </w:t>
+      </w:r>
+      <w:r>
+        <w:rPr>
+          <w:rStyle w:val="HTMLCode"/>
+          <w:rFonts w:eastAsiaTheme="majorEastAsia"/>
+        </w:rPr>
+        <w:t>imposters</w:t>
+      </w:r>
+      <w:r>
+        <w:t xml:space="preserve"> and </w:t>
+      </w:r>
+      <w:r>
+        <w:rPr>
+          <w:rStyle w:val="HTMLCode"/>
+          <w:rFonts w:eastAsiaTheme="majorEastAsia"/>
+        </w:rPr>
+        <w:t>imposters1</w:t>
+      </w:r>
+      <w:r>
+        <w:t xml:space="preserve">. In this run, the output folder is usually defined as </w:t>
+      </w:r>
+      <w:r>
+        <w:rPr>
+          <w:rStyle w:val="HTMLCode"/>
+          <w:rFonts w:eastAsiaTheme="majorEastAsia"/>
+        </w:rPr>
+        <w:t>hebrew_bert_sen2pro_results</w:t>
+      </w:r>
+      <w:r>
+        <w:t xml:space="preserve">. The second way is a single-pair test, for example Yehuda Alharizi against Berechiah ha-Nakdan, where the output folder is a dedicated test folder such as </w:t>
+      </w:r>
+      <w:r>
+        <w:rPr>
+          <w:rStyle w:val="HTMLCode"/>
+          <w:rFonts w:eastAsiaTheme="majorEastAsia"/>
+        </w:rPr>
+        <w:t>hebrew_bert_sen2pro_single_pair_sanity_check</w:t>
+      </w:r>
+      <w:r>
+        <w:t>. As in the CNN version, the single-pair test is recommended before a full run.</w:t>
+      </w:r>
+    </w:p>
+    <w:p>
+      <w:pPr>
+        <w:pStyle w:val="isselectedend"/>
+      </w:pPr>
+      <w:r>
+        <w:t>During the Sen2Pro run, the system cleans the texts, divides them into word segments, passes each segment through Hebrew BERT several times with MC Dropout, and calculates a representation that includes probabilistic information. Then, a balanced dataset is built from the two impostor authors, a classifier is trained, and the model is applied to the Torah chapters. From the predictions, two types of signals are created: a regular signal and a weighted signal. The weighted signal uses uncertainty information to give different weights to different segments. After that, the system calculates a distance matrix, applies KMedoids and Isolation Forest, and saves the outputs.</w:t>
+      </w:r>
+    </w:p>
+    <w:p>
+      <w:pPr>
+        <w:pStyle w:val="Heading2"/>
+      </w:pPr>
+      <w:r>
+        <w:t>A.4 Output Files</w:t>
+      </w:r>
+    </w:p>
+    <w:p>
+      <w:pPr>
+        <w:pStyle w:val="isselectedend"/>
+      </w:pPr>
+      <w:r>
+        <w:t xml:space="preserve">At the end of a correct run, the user receives several types of files in the results folder. The </w:t>
+      </w:r>
+      <w:r>
+        <w:rPr>
+          <w:rStyle w:val="HTMLCode"/>
+          <w:rFonts w:eastAsiaTheme="majorEastAsia"/>
+        </w:rPr>
+        <w:t>accuracy</w:t>
+      </w:r>
+      <w:r>
+        <w:t xml:space="preserve"> and </w:t>
+      </w:r>
+      <w:r>
+        <w:rPr>
+          <w:rStyle w:val="HTMLCode"/>
+          <w:rFonts w:eastAsiaTheme="majorEastAsia"/>
+        </w:rPr>
+        <w:t>loss</w:t>
+      </w:r>
+      <w:r>
+        <w:t xml:space="preserve"> files show the model training process in each iteration. The </w:t>
+      </w:r>
+      <w:r>
+        <w:rPr>
+          <w:rStyle w:val="HTMLCode"/>
+          <w:rFonts w:eastAsiaTheme="majorEastAsia"/>
+        </w:rPr>
+        <w:t>res_report</w:t>
+      </w:r>
+      <w:r>
+        <w:t xml:space="preserve"> files include anomaly detection scores for the textual units. The </w:t>
+      </w:r>
+      <w:r>
+        <w:rPr>
+          <w:rStyle w:val="HTMLCode"/>
+          <w:rFonts w:eastAsiaTheme="majorEastAsia"/>
+        </w:rPr>
+        <w:t>res_report_summ</w:t>
+      </w:r>
+      <w:r>
+        <w:t xml:space="preserve"> files include normalized summaries of distances. The </w:t>
+      </w:r>
+      <w:r>
+        <w:rPr>
+          <w:rStyle w:val="HTMLCode"/>
+          <w:rFonts w:eastAsiaTheme="majorEastAsia"/>
+        </w:rPr>
+        <w:t>res_report_Dist</w:t>
+      </w:r>
+      <w:r>
+        <w:t xml:space="preserve"> files include clustering labels. In addition, a distance matrix is saved in </w:t>
+      </w:r>
+      <w:r>
+        <w:rPr>
+          <w:rStyle w:val="HTMLCode"/>
+          <w:rFonts w:eastAsiaTheme="majorEastAsia"/>
+        </w:rPr>
+        <w:t>.csv</w:t>
+      </w:r>
+      <w:r>
+        <w:t xml:space="preserve"> format and sometimes also in </w:t>
+      </w:r>
+      <w:r>
+        <w:rPr>
+          <w:rStyle w:val="HTMLCode"/>
+          <w:rFonts w:eastAsiaTheme="majorEastAsia"/>
+        </w:rPr>
+        <w:t>.npy</w:t>
+      </w:r>
+      <w:r>
+        <w:t xml:space="preserve"> format. In the Sen2Pro version, more detailed files are also saved, such as </w:t>
+      </w:r>
+      <w:r>
+        <w:rPr>
+          <w:rStyle w:val="HTMLCode"/>
+          <w:rFonts w:eastAsiaTheme="majorEastAsia"/>
+        </w:rPr>
+        <w:t>predictions</w:t>
+      </w:r>
+      <w:r>
+        <w:t xml:space="preserve">, </w:t>
+      </w:r>
+      <w:r>
+        <w:rPr>
+          <w:rStyle w:val="HTMLCode"/>
+          <w:rFonts w:eastAsiaTheme="majorEastAsia"/>
+        </w:rPr>
+        <w:t>style_signals</w:t>
+      </w:r>
+      <w:r>
+        <w:t>, and run metadata.</w:t>
+      </w:r>
+    </w:p>
+    <w:p>
+      <w:pPr>
+        <w:pStyle w:val="isselectedend"/>
+      </w:pPr>
+      <w:r>
+        <w:t>The user should use these outputs to compare the two methodologies. In other words, after running the CNN version and the Sen2Pro version, the user examines whether similar patterns appear in the signal graphs, anomaly results, and clustering results. If both methodologies point to similar structures, this strengthens the confidence that the pipeline identifies meaningful patterns and not only random noise. These outputs are the basis for the research analysis of the project, according to the idea of Deep Impostors, where a text is converted into a stylistic signal, compared using DTW, and then analyzed using anomalies and clustering.</w:t>
+      </w:r>
+    </w:p>
+    <w:p>
+      <w:pPr>
+        <w:pStyle w:val="isselectedend"/>
+      </w:pPr>
+      <w:r>
+        <w:t>It is important to note that at the bottom of the notebooks there are also debug, validation, and additional testing cells. Some of these cells were intended to help during development and are not necessarily required for a regular system run. Therefore, in the normal user scenario, the user should mainly run the definition cells, the single-pair sanity check, and then the full run or resume cell. The final testing cells can be used by a developer or maintainer who wants to check shapes, the number of segments, label distribution, or validation split correctness, but they are not a required part of the normal flow.</w:t>
+      </w:r>
+    </w:p>
+    <w:p>
+      <w:pPr>
+        <w:pStyle w:val="Heading1"/>
+      </w:pPr>
+      <w:r>
+        <w:t>Appendix B — Maintenance Guide</w:t>
+      </w:r>
+    </w:p>
+    <w:p>
+      <w:pPr>
+        <w:pStyle w:val="Heading2"/>
+      </w:pPr>
+      <w:r>
+        <w:t>B.1 General Maintenance Overview</w:t>
+      </w:r>
+    </w:p>
+    <w:p>
+      <w:pPr>
+        <w:pStyle w:val="isselectedend"/>
+      </w:pPr>
+      <w:r>
+        <w:t xml:space="preserve">The system is built as two main Colab notebooks, one for the CNN version and one for the Sen2Pro version. Both notebooks implement the same general research idea — Deep Impostors — but they do it using different representations and models. From a maintenance point of view, it is recommended to treat the two notebooks as two parallel pipelines with a similar structure: paths and configuration component, corpus loading component, text cleaning component, unit segmentation component, numerical representation component, training </w:t>
+      </w:r>
+      <w:r>
+        <w:lastRenderedPageBreak/>
+        <w:t>component, prediction-on-Torah component, distance and anomaly analysis component, and result-saving component.</w:t>
+      </w:r>
+    </w:p>
+    <w:p>
+      <w:pPr>
+        <w:pStyle w:val="isselectedend"/>
+      </w:pPr>
+      <w:r>
+        <w:t>The recommended running environment is Google Colab with GPU. For the CNN version, a GPU is required to speed up network training, but RAM is also very important because the Hebrew FastText file is large. For the Sen2Pro version, a GPU is mainly required for running Hebrew BERT and MC Dropout sampling. During the project, a Colab subscription was used in order to get a stronger and more stable running environment, which made it possible to run repeated experiments and improve the system iteratively.</w:t>
+      </w:r>
+    </w:p>
+    <w:p>
+      <w:pPr>
+        <w:pStyle w:val="Heading2"/>
+      </w:pPr>
+      <w:r>
+        <w:t>B.2 Folder Structure</w:t>
+      </w:r>
+    </w:p>
+    <w:p>
+      <w:pPr>
+        <w:pStyle w:val="isselectedend"/>
+      </w:pPr>
+      <w:r>
+        <w:t>The expected folder structure of the system is as follows:</w:t>
+      </w:r>
+    </w:p>
+    <w:p>
+      <w:pPr>
+        <w:pStyle w:val="isselectedend"/>
+      </w:pPr>
       <w:r>
         <w:rPr>
           <w:rStyle w:val="HTMLCode"/>
@@ -2022,141 +2458,112 @@
         <w:t>deep_imposters_final_project</w:t>
       </w:r>
       <w:r>
-        <w:t xml:space="preserve">, and the results folder of the CNN version is usually </w:t>
-      </w:r>
-      <w:r>
-        <w:rPr>
-          <w:rStyle w:val="HTMLCode"/>
-          <w:rFonts w:eastAsiaTheme="majorEastAsia"/>
-        </w:rPr>
-        <w:t>hebrew_results</w:t>
-      </w:r>
-      <w:r>
-        <w:t xml:space="preserve">. The </w:t>
-      </w:r>
-      <w:r>
-        <w:rPr>
-          <w:rStyle w:val="HTMLCode"/>
-          <w:rFonts w:eastAsiaTheme="majorEastAsia"/>
-        </w:rPr>
-        <w:t>ExperimentConfig</w:t>
-      </w:r>
-      <w:r>
-        <w:t xml:space="preserve"> object defines the experiment parameters, such as the vector size </w:t>
-      </w:r>
-      <w:r>
-        <w:rPr>
-          <w:rStyle w:val="HTMLCode"/>
-          <w:rFonts w:eastAsiaTheme="majorEastAsia"/>
-        </w:rPr>
-        <w:t>embedding_dimension=300</w:t>
-      </w:r>
-      <w:r>
-        <w:t xml:space="preserve">, the chunk size, the representation method </w:t>
-      </w:r>
-      <w:r>
-        <w:rPr>
-          <w:rStyle w:val="HTMLCode"/>
-          <w:rFonts w:eastAsiaTheme="majorEastAsia"/>
-        </w:rPr>
-        <w:t>hebrew_fasttext_vec</w:t>
-      </w:r>
-      <w:r>
-        <w:t>, and the CNN model settings.</w:t>
-      </w:r>
-    </w:p>
-    <w:p>
-      <w:pPr>
-        <w:pStyle w:val="isselectedend"/>
-      </w:pPr>
-      <w:r>
-        <w:t xml:space="preserve">After defining the paths and parameters, the user creates a </w:t>
-      </w:r>
-      <w:r>
-        <w:rPr>
-          <w:rStyle w:val="HTMLCode"/>
-          <w:rFonts w:eastAsiaTheme="majorEastAsia"/>
-        </w:rPr>
-        <w:t>DeepImpostorsPipeline</w:t>
-      </w:r>
-      <w:r>
-        <w:t xml:space="preserve"> object and runs the command </w:t>
-      </w:r>
-      <w:r>
-        <w:rPr>
-          <w:rStyle w:val="HTMLCode"/>
-          <w:rFonts w:eastAsiaTheme="majorEastAsia"/>
-        </w:rPr>
-        <w:t>pipeline.run()</w:t>
-      </w:r>
-      <w:r>
-        <w:t>. In a full run, the system goes over author pairs from the two impostor folders, trains a CNN model for each pair, applies the model to the Torah units, and produces analysis outputs. During the run, the system cleans the Hebrew texts, removes vowel marks and cantillation marks, removes punctuation marks, removes English letters, and keeps only Hebrew tokens. Then it divides the texts into blocks, converts them into FastText embeddings, trains the CNN network, produces predictions for the Torah units, builds stylistic signals, calculates a distance matrix using FastDTW, and applies Isolation Forest and KMedoids for anomaly and cluster analysis.</w:t>
-      </w:r>
-    </w:p>
-    <w:p>
-      <w:pPr>
-        <w:pStyle w:val="isselectedend"/>
-      </w:pPr>
-      <w:r>
-        <w:t xml:space="preserve">For a user who wants to check that the system works before running a full experiment, there is an option to run a single-pair test. In this cell, two authors are defined, for example Yehuda Alharizi and Berechiah ha-Nakdan, and the system runs the full pipeline only on this pair. This test is recommended before a full run, because it allows the user to verify that the paths are correct, the text files are loaded, the FastText file is located in the correct place, and the system is able to generate output files. After this test, the user can open the output folder and check that files such as accuracy/loss graphs, </w:t>
-      </w:r>
-      <w:r>
-        <w:rPr>
-          <w:rStyle w:val="HTMLCode"/>
-          <w:rFonts w:eastAsiaTheme="majorEastAsia"/>
-        </w:rPr>
-        <w:t>res_report</w:t>
-      </w:r>
-      <w:r>
-        <w:t xml:space="preserve"> files, a distance matrix, and clustering results were created.</w:t>
-      </w:r>
-    </w:p>
-    <w:p>
-      <w:pPr>
-        <w:pStyle w:val="isselectedend"/>
-      </w:pPr>
-      <w:r>
-        <w:t xml:space="preserve">If the user wants to start a full experiment from the beginning, they should run the cell that executes </w:t>
-      </w:r>
-      <w:r>
-        <w:rPr>
-          <w:rStyle w:val="HTMLCode"/>
-          <w:rFonts w:eastAsiaTheme="majorEastAsia"/>
-        </w:rPr>
-        <w:t>pipeline.reset_progress()</w:t>
-      </w:r>
-      <w:r>
-        <w:t xml:space="preserve"> and then </w:t>
-      </w:r>
-      <w:r>
-        <w:rPr>
-          <w:rStyle w:val="HTMLCode"/>
-          <w:rFonts w:eastAsiaTheme="majorEastAsia"/>
-        </w:rPr>
-        <w:t>pipeline.run(resume=False)</w:t>
-      </w:r>
-      <w:r>
-        <w:t xml:space="preserve">. This action resets the progress file and starts the entire experiment from scratch. If the run was stopped in the middle, for example because Colab disconnected, the user should run the definition cells again and then run the recovery cell that executes </w:t>
-      </w:r>
-      <w:r>
-        <w:rPr>
-          <w:rStyle w:val="HTMLCode"/>
-          <w:rFonts w:eastAsiaTheme="majorEastAsia"/>
-        </w:rPr>
-        <w:t>pipeline.run(resume=True)</w:t>
-      </w:r>
-      <w:r>
-        <w:t xml:space="preserve">. In this mode, the system reads the </w:t>
-      </w:r>
-      <w:r>
-        <w:rPr>
-          <w:rStyle w:val="HTMLCode"/>
-          <w:rFonts w:eastAsiaTheme="majorEastAsia"/>
-        </w:rPr>
-        <w:t>progress.json</w:t>
-      </w:r>
-      <w:r>
-        <w:t xml:space="preserve"> file and continues from the next author pair that has not yet been completed.</w:t>
+        <w:rPr>
+          <w:rStyle w:val="HTMLCode"/>
+          <w:rFonts w:eastAsiaTheme="majorEastAsia"/>
+        </w:rPr>
+        <w:t>/</w:t>
+      </w:r>
+      <w:r>
+        <w:t xml:space="preserve"> is the root project folder. Inside it, there is </w:t>
+      </w:r>
+      <w:r>
+        <w:rPr>
+          <w:rStyle w:val="HTMLCode"/>
+          <w:rFonts w:eastAsiaTheme="majorEastAsia"/>
+        </w:rPr>
+        <w:t>torah_chapters/</w:t>
+      </w:r>
+      <w:r>
+        <w:t xml:space="preserve">, which contains the Torah or Torah chapter files as </w:t>
+      </w:r>
+      <w:r>
+        <w:rPr>
+          <w:rStyle w:val="HTMLCode"/>
+          <w:rFonts w:eastAsiaTheme="majorEastAsia"/>
+        </w:rPr>
+        <w:t>.txt</w:t>
+      </w:r>
+      <w:r>
+        <w:t xml:space="preserve"> files. In addition, there is </w:t>
+      </w:r>
+      <w:r>
+        <w:rPr>
+          <w:rStyle w:val="HTMLCode"/>
+          <w:rFonts w:eastAsiaTheme="majorEastAsia"/>
+        </w:rPr>
+        <w:t>imposters/</w:t>
+      </w:r>
+      <w:r>
+        <w:t xml:space="preserve">, where each subfolder represents an author from the first impostor group, and </w:t>
+      </w:r>
+      <w:r>
+        <w:rPr>
+          <w:rStyle w:val="HTMLCode"/>
+          <w:rFonts w:eastAsiaTheme="majorEastAsia"/>
+        </w:rPr>
+        <w:t>imposters1/</w:t>
+      </w:r>
+      <w:r>
+        <w:t xml:space="preserve">, where each subfolder represents an author from the second impostor group. For the CNN version, the Hebrew FastText file must be located in the path defined in </w:t>
+      </w:r>
+      <w:r>
+        <w:rPr>
+          <w:rStyle w:val="HTMLCode"/>
+          <w:rFonts w:eastAsiaTheme="majorEastAsia"/>
+        </w:rPr>
+        <w:t>PipelinePaths</w:t>
+      </w:r>
+      <w:r>
+        <w:t xml:space="preserve">. The output folders are separate, for example </w:t>
+      </w:r>
+      <w:r>
+        <w:rPr>
+          <w:rStyle w:val="HTMLCode"/>
+          <w:rFonts w:eastAsiaTheme="majorEastAsia"/>
+        </w:rPr>
+        <w:t>hebrew_results/</w:t>
+      </w:r>
+      <w:r>
+        <w:t xml:space="preserve"> for CNN, </w:t>
+      </w:r>
+      <w:r>
+        <w:rPr>
+          <w:rStyle w:val="HTMLCode"/>
+          <w:rFonts w:eastAsiaTheme="majorEastAsia"/>
+        </w:rPr>
+        <w:t>hebrew_bert_sen2pro_results/</w:t>
+      </w:r>
+      <w:r>
+        <w:t xml:space="preserve"> for Sen2Pro, and sanity/debug folders for test runs.</w:t>
+      </w:r>
+    </w:p>
+    <w:p>
+      <w:pPr>
+        <w:pStyle w:val="isselectedend"/>
+      </w:pPr>
+      <w:r>
+        <w:t xml:space="preserve">When maintaining or modifying the system, it is important not to change the input folder names without updating </w:t>
+      </w:r>
+      <w:r>
+        <w:rPr>
+          <w:rStyle w:val="HTMLCode"/>
+          <w:rFonts w:eastAsiaTheme="majorEastAsia"/>
+        </w:rPr>
+        <w:t>PipelinePaths</w:t>
+      </w:r>
+      <w:r>
+        <w:t xml:space="preserve"> accordingly. This class is the central place for paths, so every change in the folder structure should start there. If a new experiment should be run without deleting previous results, it is recommended to define a new </w:t>
+      </w:r>
+      <w:r>
+        <w:rPr>
+          <w:rStyle w:val="HTMLCode"/>
+          <w:rFonts w:eastAsiaTheme="majorEastAsia"/>
+        </w:rPr>
+        <w:t>results_root</w:t>
+      </w:r>
+      <w:r>
+        <w:t xml:space="preserve"> instead of overwriting an existing output folder.</w:t>
       </w:r>
     </w:p>
     <w:p>
@@ -2164,88 +2571,68 @@
         <w:pStyle w:val="Heading2"/>
       </w:pPr>
       <w:r>
-        <w:t>A.3 Running the Sen2Pro Version</w:t>
-      </w:r>
-    </w:p>
-    <w:p>
-      <w:pPr>
-        <w:pStyle w:val="isselectedend"/>
-      </w:pPr>
-      <w:r>
-        <w:t>To run the Sen2Pro version, the user should open the relevant Colab notebook and run the cells in order. Here as well, the process starts by mounting Google Drive and installing the required libraries. Then, the system components are defined: corpus loading, text cleaning, division into segments, creation of BERT representations with MC Dropout, building a balanced dataset, training a classifier, predicting on the Torah texts, building style signals, calculating a distance matrix, performing anomaly and clustering analysis, and saving the outputs.</w:t>
-      </w:r>
-    </w:p>
-    <w:p>
-      <w:pPr>
-        <w:pStyle w:val="isselectedend"/>
-      </w:pPr>
-      <w:r>
-        <w:t xml:space="preserve">In the Sen2Pro version, the </w:t>
-      </w:r>
-      <w:r>
-        <w:rPr>
-          <w:rStyle w:val="HTMLCode"/>
-          <w:rFonts w:eastAsiaTheme="majorEastAsia"/>
-        </w:rPr>
-        <w:t>ExperimentConfig</w:t>
-      </w:r>
-      <w:r>
-        <w:t xml:space="preserve"> object includes parameters suitable for working with Hebrew BERT: the model name </w:t>
-      </w:r>
-      <w:r>
-        <w:rPr>
-          <w:rStyle w:val="HTMLCode"/>
-          <w:rFonts w:eastAsiaTheme="majorEastAsia"/>
-        </w:rPr>
-        <w:t>bert_model_name</w:t>
-      </w:r>
-      <w:r>
-        <w:t xml:space="preserve">, maximum length </w:t>
-      </w:r>
-      <w:r>
-        <w:rPr>
-          <w:rStyle w:val="HTMLCode"/>
-          <w:rFonts w:eastAsiaTheme="majorEastAsia"/>
-        </w:rPr>
-        <w:t>max_length</w:t>
-      </w:r>
-      <w:r>
-        <w:t xml:space="preserve">, number of words in each segment, number of MC Dropout samples through </w:t>
-      </w:r>
-      <w:r>
-        <w:rPr>
-          <w:rStyle w:val="HTMLCode"/>
-          <w:rFonts w:eastAsiaTheme="majorEastAsia"/>
-        </w:rPr>
-        <w:t>mc_samples</w:t>
-      </w:r>
-      <w:r>
-        <w:t xml:space="preserve">, number of epochs, batch size, learning rate, dropout rate, and whether to freeze the BERT layers using </w:t>
-      </w:r>
-      <w:r>
-        <w:rPr>
-          <w:rStyle w:val="HTMLCode"/>
-          <w:rFonts w:eastAsiaTheme="majorEastAsia"/>
-        </w:rPr>
-        <w:t>freeze_bert</w:t>
-      </w:r>
-      <w:r>
-        <w:t>. In our implementation, the method used is Sen2Pro-style, based only on model uncertainty through MC Dropout. In other words, there is no data augmentation such as word deletion, word replacement, or adding new words. Instead, the same segment is sampled several times through the model with active dropout. This approach allows the system to obtain both a representation and an uncertainty measure for each segment.</w:t>
-      </w:r>
-    </w:p>
-    <w:p>
-      <w:pPr>
-        <w:pStyle w:val="isselectedend"/>
-      </w:pPr>
-      <w:r>
-        <w:t xml:space="preserve">The user can run the Sen2Pro version in two ways. The first way is a full run, where the system goes over all author pairs from </w:t>
-      </w:r>
-      <w:r>
-        <w:rPr>
-          <w:rStyle w:val="HTMLCode"/>
-          <w:rFonts w:eastAsiaTheme="majorEastAsia"/>
-        </w:rPr>
-        <w:t>imposters</w:t>
+        <w:t>B.3 CNN Version Components</w:t>
+      </w:r>
+    </w:p>
+    <w:p>
+      <w:pPr>
+        <w:pStyle w:val="isselectedend"/>
+      </w:pPr>
+      <w:r>
+        <w:t xml:space="preserve">In the CNN version, the </w:t>
+      </w:r>
+      <w:r>
+        <w:rPr>
+          <w:rStyle w:val="HTMLCode"/>
+          <w:rFonts w:eastAsiaTheme="majorEastAsia"/>
+        </w:rPr>
+        <w:t>TextPreprocessor</w:t>
+      </w:r>
+      <w:r>
+        <w:t xml:space="preserve"> component is responsible for Hebrew text cleaning: removing vowel marks and cantillation marks, removing English letters, removing punctuation marks, and keeping only Hebrew tokens. If in the future the cleaning policy should be changed, for example to allow hyphens, keep quotation marks, remove short words, or add stopwords, this is the place to make the change.</w:t>
+      </w:r>
+    </w:p>
+    <w:p>
+      <w:pPr>
+        <w:pStyle w:val="isselectedend"/>
+      </w:pPr>
+      <w:r>
+        <w:t xml:space="preserve">The </w:t>
+      </w:r>
+      <w:r>
+        <w:rPr>
+          <w:rStyle w:val="HTMLCode"/>
+          <w:rFonts w:eastAsiaTheme="majorEastAsia"/>
+        </w:rPr>
+        <w:t>EmbeddingTrainer</w:t>
+      </w:r>
+      <w:r>
+        <w:t xml:space="preserve"> component is responsible for loading FastText vectors and building a local Word2Vec model for the current corpus. In practice, it loads the pretrained vectors into memory, initializes existing words from FastText, and then performs short training on the experiment corpus. If the embedding model should be replaced, for example by using binary FastText, another Word2Vec model, or embeddings saved in advance, the change should be made in this component.</w:t>
+      </w:r>
+    </w:p>
+    <w:p>
+      <w:pPr>
+        <w:pStyle w:val="isselectedend"/>
+      </w:pPr>
+      <w:r>
+        <w:t xml:space="preserve">The </w:t>
+      </w:r>
+      <w:r>
+        <w:rPr>
+          <w:rStyle w:val="HTMLCode"/>
+          <w:rFonts w:eastAsiaTheme="majorEastAsia"/>
+        </w:rPr>
+        <w:t>SequenceEmbedder</w:t>
+      </w:r>
+      <w:r>
+        <w:t xml:space="preserve"> component converts token lists into fixed-size blocks. In the CNN version, the sequence length is derived from </w:t>
+      </w:r>
+      <w:r>
+        <w:rPr>
+          <w:rStyle w:val="HTMLCode"/>
+          <w:rFonts w:eastAsiaTheme="majorEastAsia"/>
+        </w:rPr>
+        <w:t>chunk_size</w:t>
       </w:r>
       <w:r>
         <w:t xml:space="preserve"> and </w:t>
@@ -2255,359 +2642,20 @@
           <w:rStyle w:val="HTMLCode"/>
           <w:rFonts w:eastAsiaTheme="majorEastAsia"/>
         </w:rPr>
-        <w:t>imposters1</w:t>
-      </w:r>
-      <w:r>
-        <w:t xml:space="preserve">. In this run, the output folder is usually defined as </w:t>
-      </w:r>
-      <w:r>
-        <w:rPr>
-          <w:rStyle w:val="HTMLCode"/>
-          <w:rFonts w:eastAsiaTheme="majorEastAsia"/>
-        </w:rPr>
-        <w:t>hebrew_bert_sen2pro_results</w:t>
-      </w:r>
-      <w:r>
-        <w:t xml:space="preserve">. The second way is a single-pair test, for example Yehuda Alharizi against Berechiah ha-Nakdan, where the output folder is a dedicated test folder such as </w:t>
-      </w:r>
-      <w:r>
-        <w:rPr>
-          <w:rStyle w:val="HTMLCode"/>
-          <w:rFonts w:eastAsiaTheme="majorEastAsia"/>
-        </w:rPr>
-        <w:lastRenderedPageBreak/>
-        <w:t>hebrew_bert_sen2pro_single_pair_sanity_check</w:t>
-      </w:r>
-      <w:r>
-        <w:t>. As in the CNN version, the single-pair test is recommended before a full run.</w:t>
-      </w:r>
-    </w:p>
-    <w:p>
-      <w:pPr>
-        <w:pStyle w:val="isselectedend"/>
-      </w:pPr>
-      <w:r>
-        <w:t>During the Sen2Pro run, the system cleans the texts, divides them into word segments, passes each segment through Hebrew BERT several times with MC Dropout, and calculates a representation that includes probabilistic information. Then, a balanced dataset is built from the two impostor authors, a classifier is trained, and the model is applied to the Torah chapters. From the predictions, two types of signals are created: a regular signal and a weighted signal. The weighted signal uses uncertainty information to give different weights to different segments. After that, the system calculates a distance matrix, applies KMedoids and Isolation Forest, and saves the outputs.</w:t>
-      </w:r>
-    </w:p>
-    <w:p>
-      <w:pPr>
-        <w:pStyle w:val="Heading2"/>
-      </w:pPr>
-      <w:r>
-        <w:t>A.4 Output Files</w:t>
-      </w:r>
-    </w:p>
-    <w:p>
-      <w:pPr>
-        <w:pStyle w:val="isselectedend"/>
-      </w:pPr>
-      <w:r>
-        <w:t xml:space="preserve">At the end of a correct run, the user receives several types of files in the results folder. The </w:t>
-      </w:r>
-      <w:r>
-        <w:rPr>
-          <w:rStyle w:val="HTMLCode"/>
-          <w:rFonts w:eastAsiaTheme="majorEastAsia"/>
-        </w:rPr>
-        <w:t>accuracy</w:t>
-      </w:r>
-      <w:r>
-        <w:t xml:space="preserve"> and </w:t>
-      </w:r>
-      <w:r>
-        <w:rPr>
-          <w:rStyle w:val="HTMLCode"/>
-          <w:rFonts w:eastAsiaTheme="majorEastAsia"/>
-        </w:rPr>
-        <w:t>loss</w:t>
-      </w:r>
-      <w:r>
-        <w:t xml:space="preserve"> files show the model training process in each iteration. The </w:t>
-      </w:r>
-      <w:r>
-        <w:rPr>
-          <w:rStyle w:val="HTMLCode"/>
-          <w:rFonts w:eastAsiaTheme="majorEastAsia"/>
-        </w:rPr>
-        <w:t>res_report</w:t>
-      </w:r>
-      <w:r>
-        <w:t xml:space="preserve"> files include anomaly detection scores for the textual units. The </w:t>
-      </w:r>
-      <w:r>
-        <w:rPr>
-          <w:rStyle w:val="HTMLCode"/>
-          <w:rFonts w:eastAsiaTheme="majorEastAsia"/>
-        </w:rPr>
-        <w:t>res_report_summ</w:t>
-      </w:r>
-      <w:r>
-        <w:t xml:space="preserve"> files include normalized summaries of distances. The </w:t>
-      </w:r>
-      <w:r>
-        <w:rPr>
-          <w:rStyle w:val="HTMLCode"/>
-          <w:rFonts w:eastAsiaTheme="majorEastAsia"/>
-        </w:rPr>
-        <w:t>res_report_Dist</w:t>
-      </w:r>
-      <w:r>
-        <w:t xml:space="preserve"> files include clustering labels. In addition, a distance matrix is saved in </w:t>
-      </w:r>
-      <w:r>
-        <w:rPr>
-          <w:rStyle w:val="HTMLCode"/>
-          <w:rFonts w:eastAsiaTheme="majorEastAsia"/>
-        </w:rPr>
-        <w:t>.csv</w:t>
-      </w:r>
-      <w:r>
-        <w:t xml:space="preserve"> format and sometimes also in </w:t>
-      </w:r>
-      <w:r>
-        <w:rPr>
-          <w:rStyle w:val="HTMLCode"/>
-          <w:rFonts w:eastAsiaTheme="majorEastAsia"/>
-        </w:rPr>
-        <w:t>.npy</w:t>
-      </w:r>
-      <w:r>
-        <w:t xml:space="preserve"> format. In the Sen2Pro version, more detailed files are also saved, such as </w:t>
-      </w:r>
-      <w:r>
-        <w:rPr>
-          <w:rStyle w:val="HTMLCode"/>
-          <w:rFonts w:eastAsiaTheme="majorEastAsia"/>
-        </w:rPr>
-        <w:t>predictions</w:t>
-      </w:r>
-      <w:r>
-        <w:t xml:space="preserve">, </w:t>
-      </w:r>
-      <w:r>
-        <w:rPr>
-          <w:rStyle w:val="HTMLCode"/>
-          <w:rFonts w:eastAsiaTheme="majorEastAsia"/>
-        </w:rPr>
-        <w:t>style_signals</w:t>
-      </w:r>
-      <w:r>
-        <w:t>, and run metadata.</w:t>
-      </w:r>
-    </w:p>
-    <w:p>
-      <w:pPr>
-        <w:pStyle w:val="isselectedend"/>
-      </w:pPr>
-      <w:r>
-        <w:t>The user should use these outputs to compare the two methodologies. In other words, after running the CNN version and the Sen2Pro version, the user examines whether similar patterns appear in the signal graphs, anomaly results, and clustering results. If both methodologies point to similar structures, this strengthens the confidence that the pipeline identifies meaningful patterns and not only random noise. These outputs are the basis for the research analysis of the project, according to the idea of Deep Impostors, where a text is converted into a stylistic signal, compared using DTW, and then analyzed using anomalies and clustering.</w:t>
-      </w:r>
-    </w:p>
-    <w:p>
-      <w:pPr>
-        <w:pStyle w:val="isselectedend"/>
-      </w:pPr>
-      <w:r>
-        <w:t>It is important to note that at the bottom of the notebooks there are also debug, validation, and additional testing cells. Some of these cells were intended to help during development and are not necessarily required for a regular system run. Therefore, in the normal user scenario, the user should mainly run the definition cells, the single-pair sanity check, and then the full run or resume cell. The final testing cells can be used by a developer or maintainer who wants to check shapes, the number of segments, label distribution, or validation split correctness, but they are not a required part of the normal flow.</w:t>
-      </w:r>
-    </w:p>
-    <w:p>
-      <w:pPr>
-        <w:pStyle w:val="Heading1"/>
-      </w:pPr>
-      <w:r>
-        <w:t>Appendix B — Maintenance Guide</w:t>
-      </w:r>
-    </w:p>
-    <w:p>
-      <w:pPr>
-        <w:pStyle w:val="Heading2"/>
-      </w:pPr>
-      <w:r>
-        <w:t>B.1 General Maintenance Overview</w:t>
-      </w:r>
-    </w:p>
-    <w:p>
-      <w:pPr>
-        <w:pStyle w:val="isselectedend"/>
-      </w:pPr>
-      <w:r>
-        <w:t>The system is built as two main Colab notebooks, one for the CNN version and one for the Sen2Pro version. Both notebooks implement the same general research idea — Deep Impostors — but they do it using different representations and models. From a maintenance point of view, it is recommended to treat the two notebooks as two parallel pipelines with a similar structure: paths and configuration component, corpus loading component, text cleaning component, unit segmentation component, numerical representation component, training component, prediction-on-Torah component, distance and anomaly analysis component, and result-saving component.</w:t>
-      </w:r>
-    </w:p>
-    <w:p>
-      <w:pPr>
-        <w:pStyle w:val="isselectedend"/>
-      </w:pPr>
-      <w:r>
-        <w:t xml:space="preserve">The recommended running environment is Google Colab with GPU. For the CNN version, a GPU is required to speed up network training, but RAM is also very important because the Hebrew FastText file is large. For the Sen2Pro version, a GPU is mainly required for running Hebrew BERT and MC Dropout sampling. During the </w:t>
-      </w:r>
-      <w:r>
-        <w:lastRenderedPageBreak/>
-        <w:t>project, a Colab subscription was used in order to get a stronger and more stable running environment, which made it possible to run repeated experiments and improve the system iteratively.</w:t>
-      </w:r>
-    </w:p>
-    <w:p>
-      <w:pPr>
-        <w:pStyle w:val="Heading2"/>
-      </w:pPr>
-      <w:r>
-        <w:t>B.2 Folder Structure</w:t>
-      </w:r>
-    </w:p>
-    <w:p>
-      <w:pPr>
-        <w:pStyle w:val="isselectedend"/>
-      </w:pPr>
-      <w:r>
-        <w:t>The expected folder structure of the system is as follows:</w:t>
-      </w:r>
-    </w:p>
-    <w:p>
-      <w:pPr>
-        <w:pStyle w:val="isselectedend"/>
-      </w:pPr>
-      <w:r>
-        <w:rPr>
-          <w:rStyle w:val="HTMLCode"/>
-          <w:rFonts w:eastAsiaTheme="majorEastAsia"/>
-        </w:rPr>
-        <w:t>deep_imposters_final_project</w:t>
-      </w:r>
-      <w:r>
-        <w:rPr>
-          <w:rStyle w:val="HTMLCode"/>
-          <w:rFonts w:eastAsiaTheme="majorEastAsia"/>
-        </w:rPr>
-        <w:t>/</w:t>
-      </w:r>
-      <w:r>
-        <w:t xml:space="preserve"> is the root project folder. Inside it, there is </w:t>
-      </w:r>
-      <w:r>
-        <w:rPr>
-          <w:rStyle w:val="HTMLCode"/>
-          <w:rFonts w:eastAsiaTheme="majorEastAsia"/>
-        </w:rPr>
-        <w:t>torah_chapters/</w:t>
-      </w:r>
-      <w:r>
-        <w:t xml:space="preserve">, which contains the Torah or Torah chapter files as </w:t>
-      </w:r>
-      <w:r>
-        <w:rPr>
-          <w:rStyle w:val="HTMLCode"/>
-          <w:rFonts w:eastAsiaTheme="majorEastAsia"/>
-        </w:rPr>
-        <w:t>.txt</w:t>
-      </w:r>
-      <w:r>
-        <w:t xml:space="preserve"> files. In addition, there is </w:t>
-      </w:r>
-      <w:r>
-        <w:rPr>
-          <w:rStyle w:val="HTMLCode"/>
-          <w:rFonts w:eastAsiaTheme="majorEastAsia"/>
-        </w:rPr>
-        <w:t>imposters/</w:t>
-      </w:r>
-      <w:r>
-        <w:t xml:space="preserve">, where each subfolder represents an author from the first impostor group, and </w:t>
-      </w:r>
-      <w:r>
-        <w:rPr>
-          <w:rStyle w:val="HTMLCode"/>
-          <w:rFonts w:eastAsiaTheme="majorEastAsia"/>
-        </w:rPr>
-        <w:t>imposters1/</w:t>
-      </w:r>
-      <w:r>
-        <w:t xml:space="preserve">, where each subfolder represents an author from the second impostor group. For the CNN version, the Hebrew FastText file must be located in the path defined in </w:t>
-      </w:r>
-      <w:r>
-        <w:rPr>
-          <w:rStyle w:val="HTMLCode"/>
-          <w:rFonts w:eastAsiaTheme="majorEastAsia"/>
-        </w:rPr>
-        <w:t>PipelinePaths</w:t>
-      </w:r>
-      <w:r>
-        <w:t xml:space="preserve">. The output folders are separate, for example </w:t>
-      </w:r>
-      <w:r>
-        <w:rPr>
-          <w:rStyle w:val="HTMLCode"/>
-          <w:rFonts w:eastAsiaTheme="majorEastAsia"/>
-        </w:rPr>
-        <w:t>hebrew_results/</w:t>
-      </w:r>
-      <w:r>
-        <w:t xml:space="preserve"> for CNN, </w:t>
-      </w:r>
-      <w:r>
-        <w:rPr>
-          <w:rStyle w:val="HTMLCode"/>
-          <w:rFonts w:eastAsiaTheme="majorEastAsia"/>
-        </w:rPr>
-        <w:t>hebrew_bert_sen2pro_results/</w:t>
-      </w:r>
-      <w:r>
-        <w:t xml:space="preserve"> for Sen2Pro, and sanity/debug folders for test runs.</w:t>
-      </w:r>
-    </w:p>
-    <w:p>
-      <w:pPr>
-        <w:pStyle w:val="isselectedend"/>
-      </w:pPr>
-      <w:r>
-        <w:t xml:space="preserve">When maintaining or modifying the system, it is important not to change the input folder names without updating </w:t>
-      </w:r>
-      <w:r>
-        <w:rPr>
-          <w:rStyle w:val="HTMLCode"/>
-          <w:rFonts w:eastAsiaTheme="majorEastAsia"/>
-        </w:rPr>
-        <w:t>PipelinePaths</w:t>
-      </w:r>
-      <w:r>
-        <w:t xml:space="preserve"> accordingly. This class is the central place for paths, so every change in the folder structure should start there. If a new experiment should be run without deleting previous results, it is recommended to define a new </w:t>
-      </w:r>
-      <w:r>
-        <w:rPr>
-          <w:rStyle w:val="HTMLCode"/>
-          <w:rFonts w:eastAsiaTheme="majorEastAsia"/>
-        </w:rPr>
-        <w:t>results_root</w:t>
-      </w:r>
-      <w:r>
-        <w:t xml:space="preserve"> instead of overwriting an existing output folder.</w:t>
-      </w:r>
-    </w:p>
-    <w:p>
-      <w:pPr>
-        <w:pStyle w:val="Heading2"/>
-      </w:pPr>
-      <w:r>
-        <w:t>B.3 CNN Version Components</w:t>
-      </w:r>
-    </w:p>
-    <w:p>
-      <w:pPr>
-        <w:pStyle w:val="isselectedend"/>
-      </w:pPr>
-      <w:r>
-        <w:t xml:space="preserve">In the CNN version, the </w:t>
-      </w:r>
-      <w:r>
-        <w:rPr>
-          <w:rStyle w:val="HTMLCode"/>
-          <w:rFonts w:eastAsiaTheme="majorEastAsia"/>
-        </w:rPr>
-        <w:t>TextPreprocessor</w:t>
-      </w:r>
-      <w:r>
-        <w:t xml:space="preserve"> component is responsible for Hebrew text cleaning: removing vowel marks and cantillation marks, removing English letters, removing punctuation marks, and keeping only Hebrew tokens. If in the future the cleaning policy should be changed, for example to allow hyphens, keep quotation marks, remove short words, or add stopwords, this is the place to make the change.</w:t>
+        <w:t>batch_factor</w:t>
+      </w:r>
+      <w:r>
+        <w:t xml:space="preserve">, where </w:t>
+      </w:r>
+      <w:r>
+        <w:rPr>
+          <w:rStyle w:val="HTMLCode"/>
+          <w:rFonts w:eastAsiaTheme="majorEastAsia"/>
+        </w:rPr>
+        <w:t>sequence_length = chunk_size // batch_factor</w:t>
+      </w:r>
+      <w:r>
+        <w:t>. Changing the window size directly affects the number of blocks, the input shape of the network, and the length of the stylistic signal that will be produced. Therefore, every change to these parameters should be documented, because they affect the research results.</w:t>
       </w:r>
     </w:p>
     <w:p>
@@ -2622,104 +2670,10 @@
           <w:rStyle w:val="HTMLCode"/>
           <w:rFonts w:eastAsiaTheme="majorEastAsia"/>
         </w:rPr>
-        <w:t>EmbeddingTrainer</w:t>
-      </w:r>
-      <w:r>
-        <w:t xml:space="preserve"> component is responsible for loading FastText vectors and building a local Word2Vec model for the current corpus. In practice, it loads the pretrained vectors into memory, initializes existing words from FastText, and then performs short training on the experiment corpus. If the embedding model should be replaced, for example by using binary FastText, another Word2Vec model, or embeddings saved in advance, the change should be made in this component.</w:t>
-      </w:r>
-    </w:p>
-    <w:p>
-      <w:pPr>
-        <w:pStyle w:val="isselectedend"/>
-      </w:pPr>
-      <w:r>
-        <w:t xml:space="preserve">The </w:t>
-      </w:r>
-      <w:r>
-        <w:rPr>
-          <w:rStyle w:val="HTMLCode"/>
-          <w:rFonts w:eastAsiaTheme="majorEastAsia"/>
-        </w:rPr>
-        <w:t>SequenceEmbedder</w:t>
-      </w:r>
-      <w:r>
-        <w:t xml:space="preserve"> component converts token lists into fixed-size blocks. In the CNN version, the sequence length is derived from </w:t>
-      </w:r>
-      <w:r>
-        <w:rPr>
-          <w:rStyle w:val="HTMLCode"/>
-          <w:rFonts w:eastAsiaTheme="majorEastAsia"/>
-        </w:rPr>
-        <w:t>chunk_size</w:t>
-      </w:r>
-      <w:r>
-        <w:t xml:space="preserve"> and </w:t>
-      </w:r>
-      <w:r>
-        <w:rPr>
-          <w:rStyle w:val="HTMLCode"/>
-          <w:rFonts w:eastAsiaTheme="majorEastAsia"/>
-        </w:rPr>
-        <w:t>batch_factor</w:t>
-      </w:r>
-      <w:r>
-        <w:t xml:space="preserve">, where </w:t>
-      </w:r>
-      <w:r>
-        <w:rPr>
-          <w:rStyle w:val="HTMLCode"/>
-          <w:rFonts w:eastAsiaTheme="majorEastAsia"/>
-        </w:rPr>
-        <w:t>sequence_length = chunk_size // batch_factor</w:t>
-      </w:r>
-      <w:r>
-        <w:t>. Changing the window size directly affects the number of blocks, the input shape of the network, and the length of the stylistic signal that will be produced. Therefore, every change to these parameters should be documented, because they affect the research results.</w:t>
-      </w:r>
-    </w:p>
-    <w:p>
-      <w:pPr>
-        <w:pStyle w:val="isselectedend"/>
-      </w:pPr>
-      <w:r>
-        <w:t xml:space="preserve">The </w:t>
-      </w:r>
-      <w:r>
-        <w:rPr>
-          <w:rStyle w:val="HTMLCode"/>
-          <w:rFonts w:eastAsiaTheme="majorEastAsia"/>
-        </w:rPr>
         <w:t>RCNNAClassifier</w:t>
       </w:r>
       <w:r>
         <w:t xml:space="preserve"> component defines the model. In the current implementation, the model includes Conv1D layers with several kernel sizes, MaxPooling layers, BiLSTM layers, an Attention mechanism, Dropout, and a Dense layer for binary classification. If the model architecture should be changed, for example by reducing the number of filters, changing the LSTM size, or replacing sigmoid with softmax, this should be done carefully and the label format should still be checked.</w:t>
-      </w:r>
-    </w:p>
-    <w:p>
-      <w:pPr>
-        <w:pStyle w:val="isselectedend"/>
-      </w:pPr>
-      <w:r>
-        <w:t xml:space="preserve">The </w:t>
-      </w:r>
-      <w:r>
-        <w:rPr>
-          <w:rStyle w:val="HTMLCode"/>
-          <w:rFonts w:eastAsiaTheme="majorEastAsia"/>
-        </w:rPr>
-        <w:t>DistanceAnalyzer</w:t>
-      </w:r>
-      <w:r>
-        <w:t xml:space="preserve"> component is responsible for converting model predictions into signals and analyzing the distances. It performs batch prediction on all Torah blocks, combines predictions according to </w:t>
-      </w:r>
-      <w:r>
-        <w:rPr>
-          <w:rStyle w:val="HTMLCode"/>
-          <w:rFonts w:eastAsiaTheme="majorEastAsia"/>
-        </w:rPr>
-        <w:t>batch_factor</w:t>
-      </w:r>
-      <w:r>
-        <w:t>, calculates a symmetric FastDTW distance matrix, and then applies Isolation Forest. If the distance metric should be changed, for example from FastDTW to Euclidean, Cosine, or Wasserstein distance, this is the main component where the change should be made.</w:t>
       </w:r>
     </w:p>
     <w:p>
@@ -2735,6 +2689,34 @@
           <w:rStyle w:val="HTMLCode"/>
           <w:rFonts w:eastAsiaTheme="majorEastAsia"/>
         </w:rPr>
+        <w:t>DistanceAnalyzer</w:t>
+      </w:r>
+      <w:r>
+        <w:t xml:space="preserve"> component is responsible for converting model predictions into signals and analyzing the distances. It performs batch prediction on all Torah blocks, combines predictions according to </w:t>
+      </w:r>
+      <w:r>
+        <w:rPr>
+          <w:rStyle w:val="HTMLCode"/>
+          <w:rFonts w:eastAsiaTheme="majorEastAsia"/>
+        </w:rPr>
+        <w:t>batch_factor</w:t>
+      </w:r>
+      <w:r>
+        <w:t>, calculates a symmetric FastDTW distance matrix, and then applies Isolation Forest. If the distance metric should be changed, for example from FastDTW to Euclidean, Cosine, or Wasserstein distance, this is the main component where the change should be made.</w:t>
+      </w:r>
+    </w:p>
+    <w:p>
+      <w:pPr>
+        <w:pStyle w:val="isselectedend"/>
+      </w:pPr>
+      <w:r>
+        <w:t xml:space="preserve">The </w:t>
+      </w:r>
+      <w:r>
+        <w:rPr>
+          <w:rStyle w:val="HTMLCode"/>
+          <w:rFonts w:eastAsiaTheme="majorEastAsia"/>
+        </w:rPr>
         <w:t>ResultWriter</w:t>
       </w:r>
       <w:r>
@@ -3102,7 +3084,11 @@
         <w:t>scipy</w:t>
       </w:r>
       <w:r>
-        <w:t xml:space="preserve"> if they are not already available in the Colab environment. The Hebrew FastText file must be located in the defined path, and it must be readable using </w:t>
+        <w:t xml:space="preserve"> if they are </w:t>
+      </w:r>
+      <w:r>
+        <w:lastRenderedPageBreak/>
+        <w:t xml:space="preserve">not already available in the Colab environment. The Hebrew FastText file must be located in the defined path, and it must be readable using </w:t>
       </w:r>
       <w:r>
         <w:rPr>
@@ -3218,152 +3204,155 @@
         <w:pStyle w:val="isselectedend"/>
       </w:pPr>
       <w:r>
+        <w:t>There is no need to install an external system such as a database. All work is done on text files, CSV files, NPY files, and JSON files inside Google Drive. This matches the nature of the project as a research system and not as a client-server product.</w:t>
+      </w:r>
+    </w:p>
+    <w:p>
+      <w:pPr>
+        <w:pStyle w:val="Heading2"/>
+      </w:pPr>
+      <w:r>
+        <w:t>B.6 Run Management and Recovery</w:t>
+      </w:r>
+    </w:p>
+    <w:p>
+      <w:pPr>
+        <w:pStyle w:val="isselectedend"/>
+      </w:pPr>
+      <w:r>
+        <w:t xml:space="preserve">Both notebooks include a </w:t>
+      </w:r>
+      <w:r>
+        <w:rPr>
+          <w:rStyle w:val="HTMLCode"/>
+          <w:rFonts w:eastAsiaTheme="majorEastAsia"/>
+        </w:rPr>
+        <w:t>progress.json</w:t>
+      </w:r>
+      <w:r>
+        <w:t xml:space="preserve"> mechanism, whose purpose is to allow the run to continue after stopping. In a full run, after each author pair is completed, the system saves the current state. If Colab disconnects, the definition cells should be run again, followed by the resume cell. The </w:t>
+      </w:r>
+      <w:r>
+        <w:rPr>
+          <w:rStyle w:val="HTMLCode"/>
+          <w:rFonts w:eastAsiaTheme="majorEastAsia"/>
+        </w:rPr>
+        <w:t>progress.json</w:t>
+      </w:r>
+      <w:r>
+        <w:t xml:space="preserve"> file should not be deleted if the user wants to continue from the same point. If a completely new experiment should be started, </w:t>
+      </w:r>
+      <w:r>
+        <w:rPr>
+          <w:rStyle w:val="HTMLCode"/>
+          <w:rFonts w:eastAsiaTheme="majorEastAsia"/>
+        </w:rPr>
+        <w:t>reset_progress</w:t>
+      </w:r>
+      <w:r>
+        <w:t xml:space="preserve"> should be used or a new output folder should be defined.</w:t>
+      </w:r>
+    </w:p>
+    <w:p>
+      <w:pPr>
+        <w:pStyle w:val="isselectedend"/>
+      </w:pPr>
+      <w:r>
+        <w:t>It is recommended for the maintainer to first run a single-pair sanity check before every major code change. This test makes it possible to verify that the change did not break the loading, cleaning, training, prediction, and output-saving stages. Only after the single-pair test finishes and valid output files are created, it is recommended to run a full experiment.</w:t>
+      </w:r>
+    </w:p>
+    <w:p>
+      <w:pPr>
+        <w:pStyle w:val="isselectedend"/>
+      </w:pPr>
+      <w:r>
+        <w:t>It should be noted that the final cells in the notebooks, especially debug and validation cells, are mainly intended for development testing. Some of them may depend on a specific notebook state, temporary parameters, or files created in previous runs. Therefore, they should not be treated as part of the official user flow. From a maintenance point of view, it is recommended to keep them as tools for developers, but to document that they are not required for a normal run. If these cells should become an official part of the system, they should be cleaned, verified to run from scratch, and given clear names and outputs.</w:t>
+      </w:r>
+    </w:p>
+    <w:p>
+      <w:pPr>
+        <w:pStyle w:val="Heading2"/>
+      </w:pPr>
+      <w:r>
+        <w:t>B.7 Recommendations for Future Maintenance and Improvement</w:t>
+      </w:r>
+    </w:p>
+    <w:p>
+      <w:pPr>
+        <w:pStyle w:val="isselectedend"/>
+      </w:pPr>
+      <w:r>
+        <w:t xml:space="preserve">In order to continue developing the system in an organized way, it is recommended in the future to separate the research code from the running cells. In other words, the main classes should be moved to separate Python files, for example </w:t>
+      </w:r>
+      <w:r>
+        <w:rPr>
+          <w:rStyle w:val="HTMLCode"/>
+          <w:rFonts w:eastAsiaTheme="majorEastAsia"/>
+        </w:rPr>
+        <w:t>preprocessing.py</w:t>
+      </w:r>
+      <w:r>
+        <w:t xml:space="preserve">, </w:t>
+      </w:r>
+      <w:r>
+        <w:rPr>
+          <w:rStyle w:val="HTMLCode"/>
+          <w:rFonts w:eastAsiaTheme="majorEastAsia"/>
+        </w:rPr>
+        <w:t>cnn_pipeline.py</w:t>
+      </w:r>
+      <w:r>
+        <w:t xml:space="preserve">, </w:t>
+      </w:r>
+      <w:r>
+        <w:rPr>
+          <w:rStyle w:val="HTMLCode"/>
+          <w:rFonts w:eastAsiaTheme="majorEastAsia"/>
+        </w:rPr>
+        <w:t>sen2pro_pipeline.py</w:t>
+      </w:r>
+      <w:r>
+        <w:t xml:space="preserve">, </w:t>
+      </w:r>
+      <w:r>
+        <w:rPr>
+          <w:rStyle w:val="HTMLCode"/>
+          <w:rFonts w:eastAsiaTheme="majorEastAsia"/>
+        </w:rPr>
+        <w:t>analysis.py</w:t>
+      </w:r>
+      <w:r>
+        <w:t xml:space="preserve">, and </w:t>
+      </w:r>
+      <w:r>
+        <w:rPr>
+          <w:rStyle w:val="HTMLCode"/>
+          <w:rFonts w:eastAsiaTheme="majorEastAsia"/>
+        </w:rPr>
+        <w:t>result_writer.py</w:t>
+      </w:r>
+      <w:r>
+        <w:t>, while the notebook should contain only running cells and documentation. This change will make maintenance, testing, reuse, and comparison between versions easier.</w:t>
+      </w:r>
+    </w:p>
+    <w:p>
+      <w:pPr>
+        <w:pStyle w:val="isselectedend"/>
+      </w:pPr>
+      <w:r>
+        <w:t>In addition, it is recommended to define an external configuration file, for example JSON or YAML, where all experiment parameters will be stored: input paths, output folder, model names, window size, number of epochs, number of MC Dropout samples, the type of signal used for distance calculation, and the clustering type. This will make it easier to reproduce experiments and compare results.</w:t>
+      </w:r>
+    </w:p>
+    <w:p>
+      <w:pPr>
+        <w:pStyle w:val="isselectedend"/>
+      </w:pPr>
+      <w:r>
+        <w:t xml:space="preserve">It is also recommended to save detailed metadata for each run. Such metadata should include the run date, notebook version, tested author names, experiment parameters, input file names, and model type. This is </w:t>
+      </w:r>
+      <w:r>
         <w:lastRenderedPageBreak/>
-        <w:t>There is no need to install an external system such as a database. All work is done on text files, CSV files, NPY files, and JSON files inside Google Drive. This matches the nature of the project as a research system and not as a client-server product.</w:t>
-      </w:r>
-    </w:p>
-    <w:p>
-      <w:pPr>
-        <w:pStyle w:val="Heading2"/>
-      </w:pPr>
-      <w:r>
-        <w:t>B.6 Run Management and Recovery</w:t>
-      </w:r>
-    </w:p>
-    <w:p>
-      <w:pPr>
-        <w:pStyle w:val="isselectedend"/>
-      </w:pPr>
-      <w:r>
-        <w:t xml:space="preserve">Both notebooks include a </w:t>
-      </w:r>
-      <w:r>
-        <w:rPr>
-          <w:rStyle w:val="HTMLCode"/>
-          <w:rFonts w:eastAsiaTheme="majorEastAsia"/>
-        </w:rPr>
-        <w:t>progress.json</w:t>
-      </w:r>
-      <w:r>
-        <w:t xml:space="preserve"> mechanism, whose purpose is to allow the run to continue after stopping. In a full run, after each author pair is completed, the system saves the current state. If Colab disconnects, the definition cells should be run again, followed by the resume cell. The </w:t>
-      </w:r>
-      <w:r>
-        <w:rPr>
-          <w:rStyle w:val="HTMLCode"/>
-          <w:rFonts w:eastAsiaTheme="majorEastAsia"/>
-        </w:rPr>
-        <w:t>progress.json</w:t>
-      </w:r>
-      <w:r>
-        <w:t xml:space="preserve"> file should not be deleted if the user wants to continue from the same point. If a completely new experiment should be started, </w:t>
-      </w:r>
-      <w:r>
-        <w:rPr>
-          <w:rStyle w:val="HTMLCode"/>
-          <w:rFonts w:eastAsiaTheme="majorEastAsia"/>
-        </w:rPr>
-        <w:t>reset_progress</w:t>
-      </w:r>
-      <w:r>
-        <w:t xml:space="preserve"> should be used or a new output folder should be defined.</w:t>
-      </w:r>
-    </w:p>
-    <w:p>
-      <w:pPr>
-        <w:pStyle w:val="isselectedend"/>
-      </w:pPr>
-      <w:r>
-        <w:t>It is recommended for the maintainer to first run a single-pair sanity check before every major code change. This test makes it possible to verify that the change did not break the loading, cleaning, training, prediction, and output-saving stages. Only after the single-pair test finishes and valid output files are created, it is recommended to run a full experiment.</w:t>
-      </w:r>
-    </w:p>
-    <w:p>
-      <w:pPr>
-        <w:pStyle w:val="isselectedend"/>
-      </w:pPr>
-      <w:r>
-        <w:t>It should be noted that the final cells in the notebooks, especially debug and validation cells, are mainly intended for development testing. Some of them may depend on a specific notebook state, temporary parameters, or files created in previous runs. Therefore, they should not be treated as part of the official user flow. From a maintenance point of view, it is recommended to keep them as tools for developers, but to document that they are not required for a normal run. If these cells should become an official part of the system, they should be cleaned, verified to run from scratch, and given clear names and outputs.</w:t>
-      </w:r>
-    </w:p>
-    <w:p>
-      <w:pPr>
-        <w:pStyle w:val="Heading2"/>
-      </w:pPr>
-      <w:r>
-        <w:t>B.7 Recommendations for Future Maintenance and Improvement</w:t>
-      </w:r>
-    </w:p>
-    <w:p>
-      <w:pPr>
-        <w:pStyle w:val="isselectedend"/>
-      </w:pPr>
-      <w:r>
-        <w:t xml:space="preserve">In order to continue developing the system in an organized way, it is recommended in the future to separate the research code from the running cells. In other words, the main classes should be moved to separate Python files, for example </w:t>
-      </w:r>
-      <w:r>
-        <w:rPr>
-          <w:rStyle w:val="HTMLCode"/>
-          <w:rFonts w:eastAsiaTheme="majorEastAsia"/>
-        </w:rPr>
-        <w:t>preprocessing.py</w:t>
-      </w:r>
-      <w:r>
-        <w:t xml:space="preserve">, </w:t>
-      </w:r>
-      <w:r>
-        <w:rPr>
-          <w:rStyle w:val="HTMLCode"/>
-          <w:rFonts w:eastAsiaTheme="majorEastAsia"/>
-        </w:rPr>
-        <w:t>cnn_pipeline.py</w:t>
-      </w:r>
-      <w:r>
-        <w:t xml:space="preserve">, </w:t>
-      </w:r>
-      <w:r>
-        <w:rPr>
-          <w:rStyle w:val="HTMLCode"/>
-          <w:rFonts w:eastAsiaTheme="majorEastAsia"/>
-        </w:rPr>
-        <w:t>sen2pro_pipeline.py</w:t>
-      </w:r>
-      <w:r>
-        <w:t xml:space="preserve">, </w:t>
-      </w:r>
-      <w:r>
-        <w:rPr>
-          <w:rStyle w:val="HTMLCode"/>
-          <w:rFonts w:eastAsiaTheme="majorEastAsia"/>
-        </w:rPr>
-        <w:t>analysis.py</w:t>
-      </w:r>
-      <w:r>
-        <w:t xml:space="preserve">, and </w:t>
-      </w:r>
-      <w:r>
-        <w:rPr>
-          <w:rStyle w:val="HTMLCode"/>
-          <w:rFonts w:eastAsiaTheme="majorEastAsia"/>
-        </w:rPr>
-        <w:t>result_writer.py</w:t>
-      </w:r>
-      <w:r>
-        <w:t>, while the notebook should contain only running cells and documentation. This change will make maintenance, testing, reuse, and comparison between versions easier.</w:t>
-      </w:r>
-    </w:p>
-    <w:p>
-      <w:pPr>
-        <w:pStyle w:val="isselectedend"/>
-      </w:pPr>
-      <w:r>
-        <w:t>In addition, it is recommended to define an external configuration file, for example JSON or YAML, where all experiment parameters will be stored: input paths, output folder, model names, window size, number of epochs, number of MC Dropout samples, the type of signal used for distance calculation, and the clustering type. This will make it easier to reproduce experiments and compare results.</w:t>
-      </w:r>
-    </w:p>
-    <w:p>
-      <w:pPr>
-        <w:pStyle w:val="isselectedend"/>
-      </w:pPr>
-      <w:r>
-        <w:t>It is also recommended to save detailed metadata for each run. Such metadata should include the run date, notebook version, tested author names, experiment parameters, input file names, and model type. This is especially important in a research project, because the results depend strongly on the selected parameters and corpora.</w:t>
+        <w:t>especially important in a research project, because the results depend strongly on the selected parameters and corpora.</w:t>
       </w:r>
     </w:p>
     <w:p>
@@ -3379,7 +3368,6 @@
         <w:pStyle w:val="NormalWeb"/>
       </w:pPr>
       <w:r>
-        <w:lastRenderedPageBreak/>
         <w:t>In general, the system is built in a way that makes it possible to continue using it even after the end of the project: adding corpora, replacing models, changing parameters, adding distance metrics, and performing new comparisons between CNN and Sen2Pro outputs. According to the Phase B requirements, this maintenance guide is meant to support exactly this continued life of the system — usage, modification, updating, and improvement over time, while describing the running environment and the dedicated installations of the developed software.</w:t>
       </w:r>
     </w:p>
@@ -3391,7 +3379,16 @@
         </w:rPr>
       </w:pPr>
     </w:p>
+    <w:p>
+      <w:pPr>
+        <w:rPr>
+          <w:lang w:val="en-IL"/>
+        </w:rPr>
+      </w:pPr>
+    </w:p>
     <w:sectPr>
+      <w:footerReference w:type="even" r:id="rId13"/>
+      <w:footerReference w:type="default" r:id="rId14"/>
       <w:pgSz w:w="12240" w:h="15840"/>
       <w:pgMar w:top="720" w:right="720" w:bottom="720" w:left="720" w:header="708" w:footer="708" w:gutter="0"/>
       <w:cols w:space="708"/>
@@ -3424,6 +3421,155 @@
     </w:p>
   </w:endnote>
 </w:endnotes>
+</file>
+
+<file path=word/footer1.xml><?xml version="1.0" encoding="utf-8"?>
+<w:ftr xmlns:wpc="http://schemas.microsoft.com/office/word/2010/wordprocessingCanvas" xmlns:cx="http://schemas.microsoft.com/office/drawing/2014/chartex" xmlns:cx1="http://schemas.microsoft.com/office/drawing/2015/9/8/chartex" xmlns:cx2="http://schemas.microsoft.com/office/drawing/2015/10/21/chartex" xmlns:cx3="http://schemas.microsoft.com/office/drawing/2016/5/9/chartex" xmlns:cx4="http://schemas.microsoft.com/office/drawing/2016/5/10/chartex" xmlns:cx5="http://schemas.microsoft.com/office/drawing/2016/5/11/chartex" xmlns:cx6="http://schemas.microsoft.com/office/drawing/2016/5/12/chartex" xmlns:cx7="http://schemas.microsoft.com/office/drawing/2016/5/13/chartex" xmlns:cx8="http://schemas.microsoft.com/office/drawing/2016/5/14/chartex" xmlns:mc="http://schemas.openxmlformats.org/markup-compatibility/2006" xmlns:aink="http://schemas.microsoft.com/office/drawing/2016/ink" xmlns:am3d="http://schemas.microsoft.com/office/drawing/2017/model3d" xmlns:o="urn:schemas-microsoft-com:office:office" xmlns:oel="http://schemas.microsoft.com/office/2019/extlst" xmlns:r="http://schemas.openxmlformats.org/officeDocument/2006/relationships" xmlns:m="http://schemas.openxmlformats.org/officeDocument/2006/math" xmlns:v="urn:schemas-microsoft-com:vml" xmlns:wp14="http://schemas.microsoft.com/office/word/2010/wordprocessingDrawing" xmlns:wp="http://schemas.openxmlformats.org/drawingml/2006/wordprocessingDrawing" xmlns:w10="urn:schemas-microsoft-com:office:word" xmlns:w="http://schemas.openxmlformats.org/wordprocessingml/2006/main" xmlns:w14="http://schemas.microsoft.com/office/word/2010/wordml" xmlns:w15="http://schemas.microsoft.com/office/word/2012/wordml" xmlns:w16cex="http://schemas.microsoft.com/office/word/2018/wordml/cex" xmlns:w16cid="http://schemas.microsoft.com/office/word/2016/wordml/cid" xmlns:w16="http://schemas.microsoft.com/office/word/2018/wordml" xmlns:w16sdtdh="http://schemas.microsoft.com/office/word/2020/wordml/sdtdatahash" xmlns:w16se="http://schemas.microsoft.com/office/word/2015/wordml/symex" xmlns:wpg="http://schemas.microsoft.com/office/word/2010/wordprocessingGroup" xmlns:wpi="http://schemas.microsoft.com/office/word/2010/wordprocessingInk" xmlns:wne="http://schemas.microsoft.com/office/word/2006/wordml" xmlns:wps="http://schemas.microsoft.com/office/word/2010/wordprocessingShape" mc:Ignorable="w14 w15 w16se w16cid w16 w16cex w16sdtdh wp14">
+  <w:sdt>
+    <w:sdtPr>
+      <w:rPr>
+        <w:rStyle w:val="PageNumber"/>
+      </w:rPr>
+      <w:id w:val="1441563344"/>
+      <w:docPartObj>
+        <w:docPartGallery w:val="Page Numbers (Bottom of Page)"/>
+        <w:docPartUnique/>
+      </w:docPartObj>
+    </w:sdtPr>
+    <w:sdtEndPr>
+      <w:rPr>
+        <w:rStyle w:val="PageNumber"/>
+      </w:rPr>
+    </w:sdtEndPr>
+    <w:sdtContent>
+      <w:p>
+        <w:pPr>
+          <w:pStyle w:val="Footer"/>
+          <w:framePr w:wrap="none" w:vAnchor="text" w:hAnchor="margin" w:xAlign="center" w:y="1"/>
+          <w:rPr>
+            <w:rStyle w:val="PageNumber"/>
+          </w:rPr>
+        </w:pPr>
+        <w:r>
+          <w:rPr>
+            <w:rStyle w:val="PageNumber"/>
+          </w:rPr>
+          <w:fldChar w:fldCharType="begin"/>
+        </w:r>
+        <w:r>
+          <w:rPr>
+            <w:rStyle w:val="PageNumber"/>
+          </w:rPr>
+          <w:instrText xml:space="preserve"> </w:instrText>
+        </w:r>
+        <w:r>
+          <w:rPr>
+            <w:rStyle w:val="PageNumber"/>
+          </w:rPr>
+          <w:instrText>PAGE</w:instrText>
+        </w:r>
+        <w:r>
+          <w:rPr>
+            <w:rStyle w:val="PageNumber"/>
+          </w:rPr>
+          <w:instrText xml:space="preserve"> </w:instrText>
+        </w:r>
+        <w:r>
+          <w:rPr>
+            <w:rStyle w:val="PageNumber"/>
+          </w:rPr>
+          <w:fldChar w:fldCharType="end"/>
+        </w:r>
+      </w:p>
+    </w:sdtContent>
+  </w:sdt>
+  <w:p>
+    <w:pPr>
+      <w:pStyle w:val="Footer"/>
+    </w:pPr>
+  </w:p>
+</w:ftr>
+</file>
+
+<file path=word/footer2.xml><?xml version="1.0" encoding="utf-8"?>
+<w:ftr xmlns:wpc="http://schemas.microsoft.com/office/word/2010/wordprocessingCanvas" xmlns:cx="http://schemas.microsoft.com/office/drawing/2014/chartex" xmlns:cx1="http://schemas.microsoft.com/office/drawing/2015/9/8/chartex" xmlns:cx2="http://schemas.microsoft.com/office/drawing/2015/10/21/chartex" xmlns:cx3="http://schemas.microsoft.com/office/drawing/2016/5/9/chartex" xmlns:cx4="http://schemas.microsoft.com/office/drawing/2016/5/10/chartex" xmlns:cx5="http://schemas.microsoft.com/office/drawing/2016/5/11/chartex" xmlns:cx6="http://schemas.microsoft.com/office/drawing/2016/5/12/chartex" xmlns:cx7="http://schemas.microsoft.com/office/drawing/2016/5/13/chartex" xmlns:cx8="http://schemas.microsoft.com/office/drawing/2016/5/14/chartex" xmlns:mc="http://schemas.openxmlformats.org/markup-compatibility/2006" xmlns:aink="http://schemas.microsoft.com/office/drawing/2016/ink" xmlns:am3d="http://schemas.microsoft.com/office/drawing/2017/model3d" xmlns:o="urn:schemas-microsoft-com:office:office" xmlns:oel="http://schemas.microsoft.com/office/2019/extlst" xmlns:r="http://schemas.openxmlformats.org/officeDocument/2006/relationships" xmlns:m="http://schemas.openxmlformats.org/officeDocument/2006/math" xmlns:v="urn:schemas-microsoft-com:vml" xmlns:wp14="http://schemas.microsoft.com/office/word/2010/wordprocessingDrawing" xmlns:wp="http://schemas.openxmlformats.org/drawingml/2006/wordprocessingDrawing" xmlns:w10="urn:schemas-microsoft-com:office:word" xmlns:w="http://schemas.openxmlformats.org/wordprocessingml/2006/main" xmlns:w14="http://schemas.microsoft.com/office/word/2010/wordml" xmlns:w15="http://schemas.microsoft.com/office/word/2012/wordml" xmlns:w16cex="http://schemas.microsoft.com/office/word/2018/wordml/cex" xmlns:w16cid="http://schemas.microsoft.com/office/word/2016/wordml/cid" xmlns:w16="http://schemas.microsoft.com/office/word/2018/wordml" xmlns:w16sdtdh="http://schemas.microsoft.com/office/word/2020/wordml/sdtdatahash" xmlns:w16se="http://schemas.microsoft.com/office/word/2015/wordml/symex" xmlns:wpg="http://schemas.microsoft.com/office/word/2010/wordprocessingGroup" xmlns:wpi="http://schemas.microsoft.com/office/word/2010/wordprocessingInk" xmlns:wne="http://schemas.microsoft.com/office/word/2006/wordml" xmlns:wps="http://schemas.microsoft.com/office/word/2010/wordprocessingShape" mc:Ignorable="w14 w15 w16se w16cid w16 w16cex w16sdtdh wp14">
+  <w:sdt>
+    <w:sdtPr>
+      <w:rPr>
+        <w:rStyle w:val="PageNumber"/>
+      </w:rPr>
+      <w:id w:val="1675604321"/>
+      <w:docPartObj>
+        <w:docPartGallery w:val="Page Numbers (Bottom of Page)"/>
+        <w:docPartUnique/>
+      </w:docPartObj>
+    </w:sdtPr>
+    <w:sdtEndPr>
+      <w:rPr>
+        <w:rStyle w:val="PageNumber"/>
+      </w:rPr>
+    </w:sdtEndPr>
+    <w:sdtContent>
+      <w:p>
+        <w:pPr>
+          <w:pStyle w:val="Footer"/>
+          <w:framePr w:wrap="none" w:vAnchor="text" w:hAnchor="margin" w:xAlign="center" w:y="1"/>
+          <w:rPr>
+            <w:rStyle w:val="PageNumber"/>
+          </w:rPr>
+        </w:pPr>
+        <w:r>
+          <w:rPr>
+            <w:rStyle w:val="PageNumber"/>
+          </w:rPr>
+          <w:fldChar w:fldCharType="begin"/>
+        </w:r>
+        <w:r>
+          <w:rPr>
+            <w:rStyle w:val="PageNumber"/>
+          </w:rPr>
+          <w:instrText xml:space="preserve"> </w:instrText>
+        </w:r>
+        <w:r>
+          <w:rPr>
+            <w:rStyle w:val="PageNumber"/>
+          </w:rPr>
+          <w:instrText>PAGE</w:instrText>
+        </w:r>
+        <w:r>
+          <w:rPr>
+            <w:rStyle w:val="PageNumber"/>
+          </w:rPr>
+          <w:instrText xml:space="preserve"> </w:instrText>
+        </w:r>
+        <w:r>
+          <w:rPr>
+            <w:rStyle w:val="PageNumber"/>
+          </w:rPr>
+          <w:fldChar w:fldCharType="separate"/>
+        </w:r>
+        <w:r>
+          <w:rPr>
+            <w:rStyle w:val="PageNumber"/>
+            <w:noProof/>
+          </w:rPr>
+          <w:t>1</w:t>
+        </w:r>
+        <w:r>
+          <w:rPr>
+            <w:rStyle w:val="PageNumber"/>
+          </w:rPr>
+          <w:fldChar w:fldCharType="end"/>
+        </w:r>
+      </w:p>
+    </w:sdtContent>
+  </w:sdt>
+  <w:p>
+    <w:pPr>
+      <w:pStyle w:val="Footer"/>
+    </w:pPr>
+  </w:p>
+</w:ftr>
 </file>
 
 <file path=word/footnotes.xml><?xml version="1.0" encoding="utf-8"?>
@@ -4064,6 +4210,7 @@
   <w:style w:type="character" w:default="1" w:styleId="DefaultParagraphFont">
     <w:name w:val="Default Paragraph Font"/>
     <w:uiPriority w:val="1"/>
+    <w:semiHidden/>
     <w:unhideWhenUsed/>
   </w:style>
   <w:style w:type="table" w:default="1" w:styleId="TableNormal">
@@ -4499,6 +4646,14 @@
       <w14:ligatures w14:val="none"/>
     </w:rPr>
   </w:style>
+  <w:style w:type="character" w:styleId="PageNumber">
+    <w:name w:val="page number"/>
+    <w:basedOn w:val="DefaultParagraphFont"/>
+    <w:uiPriority w:val="99"/>
+    <w:semiHidden/>
+    <w:unhideWhenUsed/>
+    <w:rsid w:val="00A93124"/>
+  </w:style>
 </w:styles>
 </file>
 

</xml_diff>